<commit_message>
Day 6+7 Completed - buffer & reflection
</commit_message>
<xml_diff>
--- a/journey/journal/week1/command-logs_week1.docx
+++ b/journey/journal/week1/command-logs_week1.docx
@@ -10726,6 +10726,104 @@
           </w:p>
         </w:tc>
       </w:tr>
+      <w:tr>
+        <w:trPr>
+          <w:tblCellSpacing w:w="15" w:type="dxa"/>
+        </w:trPr>
+        <w:tc>
+          <w:tcPr>
+            <w:tcW w:w="0" w:type="auto"/>
+            <w:tcMar>
+              <w:top w:w="15" w:type="dxa"/>
+              <w:left w:w="15" w:type="dxa"/>
+              <w:bottom w:w="15" w:type="dxa"/>
+              <w:right w:w="15" w:type="dxa"/>
+            </w:tcMar>
+            <w:vAlign w:val="center"/>
+          </w:tcPr>
+          <w:p>
+            <w:pPr>
+              <w:rPr>
+                <w:rStyle w:val="HTMLCode"/>
+                <w:rFonts w:eastAsiaTheme="minorEastAsia"/>
+                <w:szCs w:val="22"/>
+              </w:rPr>
+            </w:pPr>
+            <w:r>
+              <w:rPr>
+                <w:rFonts w:ascii="Courier New" w:hAnsi="Courier New" w:cs="Times New Roman"/>
+                <w:sz w:val="20"/>
+              </w:rPr>
+              <w:t>grep -</w:t>
+            </w:r>
+            <w:proofErr w:type="spellStart"/>
+            <w:r>
+              <w:rPr>
+                <w:rFonts w:ascii="Courier New" w:hAnsi="Courier New" w:cs="Times New Roman"/>
+                <w:sz w:val="20"/>
+              </w:rPr>
+              <w:t>rin</w:t>
+            </w:r>
+            <w:proofErr w:type="spellEnd"/>
+          </w:p>
+        </w:tc>
+        <w:tc>
+          <w:tcPr>
+            <w:tcW w:w="0" w:type="auto"/>
+            <w:tcMar>
+              <w:top w:w="15" w:type="dxa"/>
+              <w:left w:w="15" w:type="dxa"/>
+              <w:bottom w:w="15" w:type="dxa"/>
+              <w:right w:w="15" w:type="dxa"/>
+            </w:tcMar>
+            <w:vAlign w:val="center"/>
+          </w:tcPr>
+          <w:p>
+            <w:r>
+              <w:t xml:space="preserve"> -r recursive </w:t>
+            </w:r>
+          </w:p>
+          <w:p>
+            <w:r>
+              <w:t xml:space="preserve"> -</w:t>
+            </w:r>
+            <w:proofErr w:type="spellStart"/>
+            <w:r>
+              <w:t>i</w:t>
+            </w:r>
+            <w:proofErr w:type="spellEnd"/>
+            <w:r>
+              <w:t xml:space="preserve"> ignore case </w:t>
+            </w:r>
+          </w:p>
+          <w:p>
+            <w:r>
+              <w:t xml:space="preserve"> -n show line numbers</w:t>
+            </w:r>
+          </w:p>
+        </w:tc>
+        <w:tc>
+          <w:tcPr>
+            <w:tcW w:w="0" w:type="auto"/>
+            <w:tcMar>
+              <w:top w:w="15" w:type="dxa"/>
+              <w:left w:w="15" w:type="dxa"/>
+              <w:bottom w:w="15" w:type="dxa"/>
+              <w:right w:w="15" w:type="dxa"/>
+            </w:tcMar>
+            <w:vAlign w:val="center"/>
+          </w:tcPr>
+          <w:p>
+            <w:pPr>
+              <w:rPr>
+                <w:rStyle w:val="HTMLCode"/>
+                <w:rFonts w:eastAsiaTheme="minorEastAsia"/>
+                <w:szCs w:val="22"/>
+              </w:rPr>
+            </w:pPr>
+          </w:p>
+        </w:tc>
+      </w:tr>
     </w:tbl>
     <w:p>
       <w:pPr>
@@ -10740,6 +10838,21 @@
     </w:p>
     <w:p>
       <w:pPr>
+        <w:spacing w:line="259" w:lineRule="auto"/>
+        <w:rPr>
+          <w:rFonts w:ascii="Times New Roman" w:hAnsi="Times New Roman" w:cs="Times New Roman"/>
+          <w:b/>
+          <w:bCs/>
+          <w:sz w:val="24"/>
+          <w:szCs w:val="24"/>
+        </w:rPr>
+      </w:pPr>
+      <w:r>
+        <w:br w:type="page"/>
+      </w:r>
+    </w:p>
+    <w:p>
+      <w:pPr>
         <w:pStyle w:val="Heading2"/>
         <w:rPr>
           <w:rFonts w:eastAsiaTheme="minorEastAsia"/>
@@ -10749,6 +10862,7 @@
         <w:rPr>
           <w:rFonts w:eastAsiaTheme="minorEastAsia"/>
         </w:rPr>
+        <w:lastRenderedPageBreak/>
         <w:t>Sorting and Unique</w:t>
       </w:r>
     </w:p>
@@ -11150,7 +11264,6 @@
         <w:rPr>
           <w:rFonts w:eastAsiaTheme="minorEastAsia"/>
         </w:rPr>
-        <w:lastRenderedPageBreak/>
         <w:t>Pipes and Redirection</w:t>
       </w:r>
     </w:p>
@@ -11663,6 +11776,22 @@
     </w:p>
     <w:p>
       <w:pPr>
+        <w:spacing w:line="259" w:lineRule="auto"/>
+        <w:rPr>
+          <w:rFonts w:asciiTheme="majorHAnsi" w:hAnsiTheme="majorHAnsi" w:cs="Times New Roman"/>
+          <w:b/>
+          <w:bCs/>
+          <w:kern w:val="32"/>
+          <w:sz w:val="32"/>
+          <w:szCs w:val="32"/>
+        </w:rPr>
+      </w:pPr>
+      <w:r>
+        <w:br w:type="page"/>
+      </w:r>
+    </w:p>
+    <w:p>
+      <w:pPr>
         <w:pStyle w:val="Heading1"/>
         <w:rPr>
           <w:rFonts w:eastAsiaTheme="minorEastAsia"/>
@@ -11672,25 +11801,8 @@
         <w:rPr>
           <w:rFonts w:eastAsiaTheme="minorEastAsia"/>
         </w:rPr>
-        <w:t xml:space="preserve">Bandit Levels </w:t>
-      </w:r>
-      <w:r>
-        <w:rPr>
-          <w:rFonts w:eastAsiaTheme="minorEastAsia"/>
-        </w:rPr>
-        <w:t>10</w:t>
-      </w:r>
-      <w:r>
-        <w:rPr>
-          <w:rFonts w:eastAsiaTheme="minorEastAsia"/>
-        </w:rPr>
-        <w:t>–1</w:t>
-      </w:r>
-      <w:r>
-        <w:rPr>
-          <w:rFonts w:eastAsiaTheme="minorEastAsia"/>
-        </w:rPr>
-        <w:t>5</w:t>
+        <w:lastRenderedPageBreak/>
+        <w:t>Bandit Levels 10–15</w:t>
       </w:r>
     </w:p>
     <w:tbl>
@@ -12317,15 +12429,6 @@
         </w:tc>
       </w:tr>
     </w:tbl>
-    <w:p/>
-    <w:p>
-      <w:pPr>
-        <w:spacing w:line="259" w:lineRule="auto"/>
-      </w:pPr>
-      <w:r>
-        <w:br w:type="page"/>
-      </w:r>
-    </w:p>
     <w:p>
       <w:bookmarkStart w:id="0" w:name="_GoBack"/>
       <w:bookmarkEnd w:id="0"/>

</xml_diff>

<commit_message>
Day 8 complete - HTTP/curl
</commit_message>
<xml_diff>
--- a/journey/journal/week1/command-logs_week1.docx
+++ b/journey/journal/week1/command-logs_week1.docx
@@ -12046,11 +12046,8 @@
             <w:hideMark/>
           </w:tcPr>
           <w:p>
-            <w:proofErr w:type="spellStart"/>
-            <w:r>
-              <w:t>gzip</w:t>
-            </w:r>
-            <w:proofErr w:type="spellEnd"/>
+            <w:bookmarkStart w:id="0" w:name="_GoBack"/>
+            <w:bookmarkEnd w:id="0"/>
             <w:r>
               <w:t xml:space="preserve"> -d</w:t>
             </w:r>
@@ -12429,10 +12426,7 @@
         </w:tc>
       </w:tr>
     </w:tbl>
-    <w:p>
-      <w:bookmarkStart w:id="0" w:name="_GoBack"/>
-      <w:bookmarkEnd w:id="0"/>
-    </w:p>
+    <w:p/>
     <w:sectPr>
       <w:type w:val="continuous"/>
       <w:pgSz w:w="11910" w:h="16840" w:code="9"/>
@@ -12920,6 +12914,7 @@
   <w:style w:type="character" w:default="1" w:styleId="DefaultParagraphFont">
     <w:name w:val="Default Paragraph Font"/>
     <w:uiPriority w:val="1"/>
+    <w:semiHidden/>
     <w:unhideWhenUsed/>
   </w:style>
   <w:style w:type="table" w:default="1" w:styleId="TableNormal">

</xml_diff>